<commit_message>
Writing kit: full final text for every section with IEEE citations
Each section folder now has FINAL_TEXT.md/.docx: complete thesis prose
with numbered headings, numbered tables and figures inserted, in-text
IEEE citations and a per-section reference list. REFERENCES_ALL lists
all 46 verified references in thesis-wide citation order. Sources and
the build script live in writing/_scripts.

Co-Authored-By: Claude Opus 5 (1M context) <noreply@anthropic.com>
</commit_message>
<xml_diff>
--- a/writing/README.docx
+++ b/writing/README.docx
@@ -186,6 +186,44 @@
           </w:p>
         </w:tc>
       </w:tr>
+      <w:tr>
+        <w:tc>
+          <w:tcPr>
+            <w:tcW w:type="dxa" w:w="4968"/>
+          </w:tcPr>
+          <w:p>
+            <w:r/>
+            <w:r>
+              <w:rPr>
+                <w:b/>
+                <w:sz w:val="16"/>
+              </w:rPr>
+              <w:t>`FINAL_TEXT.docx` / `.md`</w:t>
+            </w:r>
+          </w:p>
+        </w:tc>
+        <w:tc>
+          <w:tcPr>
+            <w:tcW w:type="dxa" w:w="4968"/>
+          </w:tcPr>
+          <w:p>
+            <w:r/>
+            <w:r>
+              <w:rPr>
+                <w:b/>
+                <w:sz w:val="16"/>
+              </w:rPr>
+              <w:t>The complete section, written in final thesis form</w:t>
+            </w:r>
+            <w:r>
+              <w:rPr>
+                <w:sz w:val="16"/>
+              </w:rPr>
+              <w:t>: numbered headings, finished prose, numbered tables and figures inserted, IEEE in-text citations, and the reference list for that section at the end. Copy this into the thesis.</w:t>
+            </w:r>
+          </w:p>
+        </w:tc>
+      </w:tr>
     </w:tbl>
     <w:p/>
     <w:p>
@@ -232,7 +270,56 @@
         <w:br/>
         <w:t>python writing/_scripts/build_writing_figures.py    # figures (run after the tables)</w:t>
         <w:br/>
-        <w:t>python writing/_scripts/build_writing_docx.py       # Word versions with tables and figures embedded</w:t>
+        <w:t>python writing/_scripts/build_writing_docx.py       # Word versions of the guides</w:t>
+        <w:br/>
+        <w:t>python writing/_scripts/build_final_text.py         # FINAL_TEXT files + REFERENCES_ALL</w:t>
+      </w:r>
+    </w:p>
+    <w:p>
+      <w:r>
+        <w:rPr>
+          <w:b/>
+        </w:rPr>
+        <w:t>Citations.</w:t>
+      </w:r>
+      <w:r>
+        <w:t xml:space="preserve"> All sections use IEEE numbered citations, numbered in order of first appearance across the thesis, so a paper has the same number in every section. The complete, numbered reference list is </w:t>
+      </w:r>
+      <w:r>
+        <w:rPr>
+          <w:rFonts w:ascii="Consolas" w:hAnsi="Consolas"/>
+        </w:rPr>
+        <w:t>REFERENCES_ALL.docx</w:t>
+      </w:r>
+      <w:r>
+        <w:t xml:space="preserve">. Every entry was checked against the publisher's page. To change wording, edit </w:t>
+      </w:r>
+      <w:r>
+        <w:rPr>
+          <w:rFonts w:ascii="Consolas" w:hAnsi="Consolas"/>
+        </w:rPr>
+        <w:t>writing/_scripts/final_text_src/&lt;section&gt;.md</w:t>
+      </w:r>
+      <w:r>
+        <w:t xml:space="preserve"> (citations are written </w:t>
+      </w:r>
+      <w:r>
+        <w:rPr>
+          <w:rFonts w:ascii="Consolas" w:hAnsi="Consolas"/>
+        </w:rPr>
+        <w:t>{cite:key}</w:t>
+      </w:r>
+      <w:r>
+        <w:t xml:space="preserve">, keys in </w:t>
+      </w:r>
+      <w:r>
+        <w:rPr>
+          <w:rFonts w:ascii="Consolas" w:hAnsi="Consolas"/>
+        </w:rPr>
+        <w:t>references.py</w:t>
+      </w:r>
+      <w:r>
+        <w:t>) and rebuild. If you edit a FINAL_TEXT.docx directly, your edits will be overwritten the next time the build runs, so copy finished text into the thesis document first.</w:t>
       </w:r>
     </w:p>
     <w:p>

</xml_diff>